<commit_message>
Atualiza documento de Padrões de Projeto e SOLID (PostgreSQL, 52 testes)
</commit_message>
<xml_diff>
--- a/estacao/Padrões de Projeto e SOLID - Estação Ambiental (ExpoTech 2026.2).docx
+++ b/estacao/Padrões de Projeto e SOLID - Estação Ambiental (ExpoTech 2026.2).docx
@@ -245,7 +245,7 @@
           <w:p>
             <w:pPr/>
             <w:r>
-              <w:t xml:space="preserve">Interface de persistência e implementação em SQLite</w:t>
+              <w:t>Interface de persistência e implementações SQLite e PostgreSQL</w:t>
             </w:r>
           </w:p>
         </w:tc>
@@ -1177,10 +1177,10 @@
         <w:rPr>
           <w:rStyle w:val="CodeChar"/>
         </w:rPr>
-        <w:t xml:space="preserve">SqliteReadingRepository</w:t>
-      </w:r>
-      <w:r>
-        <w:t xml:space="preserve"> o cumpre. Qualquer outra implementação (por exemplo, um banco gerenciado na Azure) pode entrar no lugar sem alterar o serviço. Na entrega da nuvem, a segunda implementação vai usar os mesmos testes de contrato.</w:t>
+        <w:t>SqliteReadingRepository</w:t>
+      </w:r>
+      <w:r>
+        <w:t xml:space="preserve"> e PostgresReadingRepository o cumprem: o mesmo conjunto de testes de contrato roda nos dois (SQLite sempre, PostgreSQL quando há um banco de teste). Em produção a API usa o banco gerenciado da Azure (PostgreSQL) e, no desenvolvimento local, o SQLite, sem alterar o serviço.</w:t>
       </w:r>
     </w:p>
     <w:p>
@@ -1274,15 +1274,25 @@
       <w:bookmarkStart w:id="7" w:name="bongo_lang_python_7"/>
       <w:bookmarkEnd w:id="7"/>
       <w:r>
-        <w:t xml:space="preserve">service = ReadingService(</w:t>
-        <w:br/>
-        <w:t xml:space="preserve">    SqliteReadingRepository(config.DATABASE_PATH),</w:t>
+        <w:t>repository = (</w:t>
+        <w:br/>
+        <w:t xml:space="preserve">    PostgresReadingRepository(config.DATABASE_URL)</w:t>
+        <w:br/>
+        <w:t xml:space="preserve">    if config.DATABASE_URL</w:t>
+        <w:br/>
+        <w:t xml:space="preserve">    else SqliteReadingRepository(config.DATABASE_PATH)</w:t>
+        <w:br/>
+        <w:t>)</w:t>
+        <w:br/>
+        <w:t>service = ReadingService(</w:t>
+        <w:br/>
+        <w:t xml:space="preserve">    repository,</w:t>
         <w:br/>
         <w:t xml:space="preserve">    default_classifier(),</w:t>
         <w:br/>
         <w:t xml:space="preserve">    publisher,</w:t>
         <w:br/>
-        <w:t xml:space="preserve">)</w:t>
+        <w:t>)</w:t>
       </w:r>
     </w:p>
     <w:p>
@@ -1329,16 +1339,16 @@
         <w:t xml:space="preserve">Liskov:</w:t>
       </w:r>
       <w:r>
-        <w:t xml:space="preserve"> hoje existe </w:t>
-      </w:r>
-      <w:r>
-        <w:rPr>
-          <w:b/>
-        </w:rPr>
-        <w:t xml:space="preserve">uma</w:t>
-      </w:r>
-      <w:r>
-        <w:t xml:space="preserve"> implementação de repositório (SQLite). A substituição é garantida pelo desenho da interface, mas só será demonstrada de fato quando a segunda implementação (banco da Azure) existir.</w:t>
+        <w:t xml:space="preserve"> existem </w:t>
+      </w:r>
+      <w:r>
+        <w:rPr>
+          <w:b/>
+        </w:rPr>
+        <w:t>duas</w:t>
+      </w:r>
+      <w:r>
+        <w:t xml:space="preserve"> implementações de repositório (SQLite e PostgreSQL) e as duas passam nos mesmos testes de contrato. O ponto a reconhecer é que o PostgreSQL só roda nos testes quando há um banco de teste configurado (no GitHub Actions ele é criado automaticamente).</w:t>
       </w:r>
     </w:p>
     <w:p>
@@ -1713,11 +1723,9 @@
               <w:rPr>
                 <w:rStyle w:val="CodeChar"/>
               </w:rPr>
-              <w:t xml:space="preserve">test_repository.py</w:t>
-            </w:r>
-            <w:r>
-              <w:t xml:space="preserve"> (SQLite)</w:t>
-            </w:r>
+              <w:t>test_repository.py (SQLite e PostgreSQL)</w:t>
+            </w:r>
+            <w:r/>
           </w:p>
         </w:tc>
       </w:tr>
@@ -1993,7 +2001,7 @@
         <w:t xml:space="preserve">Como vocês sabem que funciona?</w:t>
       </w:r>
       <w:r>
-        <w:t xml:space="preserve"> 46 testes automatizados, incluindo a tabela-verdade completa, e uma verificação independente da otimização contra enumeração de vértices.</w:t>
+        <w:t xml:space="preserve"> 52 testes automatizados (47 rodam em qualquer PC e 5 usam o PostgreSQL no GitHub Actions), incluindo a tabela-verdade completa, e uma verificação independente da otimização contra enumeração de vértices. Além disso, o script enviar_casos.py manda os 5 casos do circuito para a API publicada e confirma 5 de 5.</w:t>
       </w:r>
     </w:p>
     <w:sectPr>

</xml_diff>